<commit_message>
fix: dedupe audit log entry on concurrent scan cancellation
Adversarial testing found that two concurrent cancel requests for the same
run could each write their own security_assessment.run_cancelled audit row,
making one real cancellation look like two in the audit trail (harmless
functionally -- task.cancel() on an already-cancelling task is a no-op --
but wrong for an audit record meant to be a reliable count of actions).

The run's own background task (_execute_run's CancelledError handler) is now
the single source of truth for that audit event; a concurrent request that
finds no live task to hand off to (the backend-restart-orphan path) still
writes its own record, but only once, gated on the direct DB update actually
having changed a row. Verified by directly querying the audit table before
and after, during a real concurrent-cancel race against a live instance.

Co-Authored-By: Claude Sonnet 5 <noreply@anthropic.com>
</commit_message>
<xml_diff>
--- a/documentation/HORIZON_GRID_CHANGELOG.docx
+++ b/documentation/HORIZON_GRID_CHANGELOG.docx
@@ -367,6 +367,27 @@
       <w:r>
         <w:rPr/>
         <w:t xml:space="preserve">5 new integration tests cover in-flight cancellation (using a deliberately slow scan so the cancellation genuinely lands mid-flight, not after the scan has already finished), the backend-restart-orphan case, rejecting a cancel on an already-finished run, an unknown run id, and RBAC enforcement.</w:t>
+      </w:r>
+    </w:p>
+    <w:p>
+      <w:pPr>
+        <w:numPr>
+          <w:ilvl w:val="0"/>
+          <w:numId w:val="1"/>
+        </w:numPr>
+        <w:spacing w:lineRule="auto"/>
+      </w:pPr>
+      <w:r>
+        <w:rPr/>
+        <w:t xml:space="preserve">A follow-up adversarial pass (racing two concurrent cancel requests for the same run) found a real, low-severity issue: both requests could each write their own </w:t>
+      </w:r>
+      <w:r>
+        <w:rPr/>
+        <w:t xml:space="preserve">run_cancelled</w:t>
+      </w:r>
+      <w:r>
+        <w:rPr/>
+        <w:t xml:space="preserve"> audit-log entry for what was really one cancellation. Fixed by making the run's own background task the single source of truth for that audit record; a request that arrives after the run is already resolving no longer writes a redundant one. Confirmed live, before and after, by directly querying the audit table during a real concurrent-cancel race.</w:t>
       </w:r>
     </w:p>
     <w:p>

</xml_diff>

<commit_message>
docs: record the installer bugs and threat_assessment fix in the changelog
Extends v0.2.3's changelog entry (both CHANGELOG.md and the narrative
standalone-changelog.md, plus the regenerated CHANGELOG PDF/DOCX) with the
three real bugs found and fixed during last night's full functional-testing
pass: the stale shipped installer missing docker-compose.yml, the leftover
verification-harness registry entry that silently redirected installs to a
fake path, and the AI threat_assessment/final_verdict contradiction bug.
Also discloses what that testing pass did and didn't cover, per this
project's own standing rule against claiming untested coverage.
</commit_message>
<xml_diff>
--- a/documentation/HORIZON_GRID_CHANGELOG.docx
+++ b/documentation/HORIZON_GRID_CHANGELOG.docx
@@ -879,6 +879,230 @@
         <w:rPr>
           <w:b/>
         </w:rPr>
+        <w:t xml:space="preserve">Installer (found by a real installation, not a synthetic test):</w:t>
+      </w:r>
+    </w:p>
+    <w:p>
+      <w:pPr>
+        <w:numPr>
+          <w:ilvl w:val="0"/>
+          <w:numId w:val="7"/>
+        </w:numPr>
+        <w:spacing w:lineRule="auto"/>
+      </w:pPr>
+      <w:r>
+        <w:rPr>
+          <w:b/>
+        </w:rPr>
+        <w:t xml:space="preserve">The shipped Windows installer was stale.</w:t>
+      </w:r>
+      <w:r>
+        <w:rPr/>
+        <w:t xml:space="preserve">release/HORIZON-GRID-Setup-0.2.3.exe</w:t>
+      </w:r>
+      <w:r>
+        <w:rPr/>
+        <w:t xml:space="preserve"> had never actually been recompiled from current source — it was missing </w:t>
+      </w:r>
+      <w:r>
+        <w:rPr/>
+        <w:t xml:space="preserve">docker-compose.yml</w:t>
+      </w:r>
+      <w:r>
+        <w:rPr/>
+        <w:t xml:space="preserve">/</w:t>
+      </w:r>
+      <w:r>
+        <w:rPr/>
+        <w:t xml:space="preserve">docker-compose.prod.yml</w:t>
+      </w:r>
+      <w:r>
+        <w:rPr/>
+        <w:t xml:space="preserve"> entirely, so a real, elevated, from-scratch install failed at </w:t>
+      </w:r>
+      <w:r>
+        <w:rPr/>
+        <w:t xml:space="preserve">docker compose up</w:t>
+      </w:r>
+      <w:r>
+        <w:rPr/>
+        <w:t xml:space="preserve"> with no other symptom (</w:t>
+      </w:r>
+      <w:r>
+        <w:rPr/>
+        <w:t xml:space="preserve">exit code 1</w:t>
+      </w:r>
+      <w:r>
+        <w:rPr/>
+        <w:t xml:space="preserve">). Fixed by recompiling from current source with a properly installed Inno Setup toolchain; both platform installers (</w:t>
+      </w:r>
+      <w:r>
+        <w:rPr/>
+        <w:t xml:space="preserve">.exe</w:t>
+      </w:r>
+      <w:r>
+        <w:rPr/>
+        <w:t xml:space="preserve"> and </w:t>
+      </w:r>
+      <w:r>
+        <w:rPr/>
+        <w:t xml:space="preserve">.deb</w:t>
+      </w:r>
+      <w:r>
+        <w:rPr/>
+        <w:t xml:space="preserve">) are rebuilt fresh for this release.</w:t>
+      </w:r>
+    </w:p>
+    <w:p>
+      <w:pPr>
+        <w:numPr>
+          <w:ilvl w:val="0"/>
+          <w:numId w:val="7"/>
+        </w:numPr>
+        <w:spacing w:lineRule="auto"/>
+      </w:pPr>
+      <w:r>
+        <w:rPr>
+          <w:b/>
+        </w:rPr>
+        <w:t xml:space="preserve">A leftover automated-verification-harness registry entry silently redirected every install to a fake path</w:t>
+      </w:r>
+      <w:r>
+        <w:rPr/>
+        <w:t xml:space="preserve">, discovered immediately after fixing the bug above (the same symptom recurred on the very next attempt, with the rebuilt installer). Inno Setup's default </w:t>
+      </w:r>
+      <w:r>
+        <w:rPr/>
+        <w:t xml:space="preserve">UsePreviousAppDir</w:t>
+      </w:r>
+      <w:r>
+        <w:rPr/>
+        <w:t xml:space="preserve"> behavior means it reuses whatever directory the </w:t>
+      </w:r>
+      <w:r>
+        <w:rPr/>
+        <w:t xml:space="preserve">previous</w:t>
+      </w:r>
+      <w:r>
+        <w:rPr/>
+        <w:t xml:space="preserve"> install on that machine used, regardless of the installer's own configured default — and an earlier automated test run had left a registry </w:t>
+      </w:r>
+      <w:r>
+        <w:rPr/>
+        <w:t xml:space="preserve">InstallLocation</w:t>
+      </w:r>
+      <w:r>
+        <w:rPr/>
+        <w:t xml:space="preserve"> pointing at a throwaway verification path. Every subsequent install (real or scripted) silently inherited that same fake directory for its file copy, while the Setup Wizard's own path logic correctly used the real </w:t>
+      </w:r>
+      <w:r>
+        <w:rPr/>
+        <w:t xml:space="preserve">C:\Program Files\...</w:t>
+      </w:r>
+      <w:r>
+        <w:rPr/>
+        <w:t xml:space="preserve"> — a straight mismatch between the two halves of the installer. Fixed by removing the stale registry key; the fix itself required no code change, but any future local verification harness must now explicitly clean up its own registry trace afterward rather than leaving a persistent </w:t>
+      </w:r>
+      <w:r>
+        <w:rPr/>
+        <w:t xml:space="preserve">InstallLocation</w:t>
+      </w:r>
+      <w:r>
+        <w:rPr/>
+        <w:t xml:space="preserve"> a real install could inherit.</w:t>
+      </w:r>
+    </w:p>
+    <w:p>
+      <w:pPr>
+        <w:numPr>
+          <w:ilvl w:val="0"/>
+          <w:numId w:val="7"/>
+        </w:numPr>
+        <w:spacing w:lineRule="auto"/>
+      </w:pPr>
+      <w:r>
+        <w:rPr>
+          <w:b/>
+        </w:rPr>
+        <w:t xml:space="preserve">Real AI-response correctness bug found on the resulting live install</w:t>
+      </w:r>
+      <w:r>
+        <w:rPr/>
+        <w:t xml:space="preserve">: investigating </w:t>
+      </w:r>
+      <w:r>
+        <w:rPr/>
+        <w:t xml:space="preserve">8.8.8.8</w:t>
+      </w:r>
+      <w:r>
+        <w:rPr/>
+        <w:t xml:space="preserve"> with Ollama returned </w:t>
+      </w:r>
+      <w:r>
+        <w:rPr/>
+        <w:t xml:space="preserve">threat_assessment: "malicious"</w:t>
+      </w:r>
+      <w:r>
+        <w:rPr/>
+        <w:t xml:space="preserve"> — a bare one-word label, not a sentence — alongside a correctly-computed </w:t>
+      </w:r>
+      <w:r>
+        <w:rPr/>
+        <w:t xml:space="preserve">final_verdict: "benign"</w:t>
+      </w:r>
+      <w:r>
+        <w:rPr/>
+        <w:t xml:space="preserve"> in the same response. The existing verdict/risk-agreement validator only checked </w:t>
+      </w:r>
+      <w:r>
+        <w:rPr/>
+        <w:t xml:space="preserve">final_verdict</w:t>
+      </w:r>
+      <w:r>
+        <w:rPr/>
+        <w:t xml:space="preserve"> against the risk numbers; nothing checked </w:t>
+      </w:r>
+      <w:r>
+        <w:rPr/>
+        <w:t xml:space="preserve">threat_assessment</w:t>
+      </w:r>
+      <w:r>
+        <w:rPr/>
+        <w:t xml:space="preserve">'s own content. The Final Assessment panel renders the two in separately-labeled tabs, so an analyst reading either one alone would see the platform's opposite conclusion. Fixed with a third, narrowly-scoped validator that only fires when </w:t>
+      </w:r>
+      <w:r>
+        <w:rPr/>
+        <w:t xml:space="preserve">threat_assessment</w:t>
+      </w:r>
+      <w:r>
+        <w:rPr/>
+        <w:t xml:space="preserve"> is an exact, bare match for a verdict-shaped word contradicting </w:t>
+      </w:r>
+      <w:r>
+        <w:rPr/>
+        <w:t xml:space="preserve">final_verdict</w:t>
+      </w:r>
+      <w:r>
+        <w:rPr/>
+        <w:t xml:space="preserve"> — confirmed via a live-reproduced regression test, and confirmed </w:t>
+      </w:r>
+      <w:r>
+        <w:rPr/>
+        <w:t xml:space="preserve">not</w:t>
+      </w:r>
+      <w:r>
+        <w:rPr/>
+        <w:t xml:space="preserve"> to fire on ordinary narrative prose that happens to contain the word "malicious" mid-sentence.</w:t>
+      </w:r>
+    </w:p>
+    <w:p>
+      <w:pPr>
+        <w:spacing w:lineRule="auto"/>
+      </w:pPr>
+      <w:r>
+        <w:rPr>
+          <w:b/>
+        </w:rPr>
         <w:t xml:space="preserve">Testing:</w:t>
       </w:r>
     </w:p>
@@ -886,26 +1110,85 @@
       <w:pPr>
         <w:numPr>
           <w:ilvl w:val="0"/>
-          <w:numId w:val="7"/>
-        </w:numPr>
-        <w:spacing w:lineRule="auto"/>
-      </w:pPr>
-      <w:r>
-        <w:rPr/>
-        <w:t xml:space="preserve">New regression tests for every fix in this release that didn't already have coverage (the retry-logic fix, the login rate limiter, the SSRF guard on both the AI-call and config-save paths). Full backend suite: 380 passed, 39 skipped (up from 365 at the start of this review).</w:t>
-      </w:r>
-    </w:p>
-    <w:p>
-      <w:pPr>
-        <w:numPr>
-          <w:ilvl w:val="0"/>
-          <w:numId w:val="7"/>
+          <w:numId w:val="8"/>
+        </w:numPr>
+        <w:spacing w:lineRule="auto"/>
+      </w:pPr>
+      <w:r>
+        <w:rPr/>
+        <w:t xml:space="preserve">New regression tests for every fix in this release that didn't already have coverage (the retry-logic fix, the login rate limiter, the SSRF guard on both the AI-call and config-save paths, and the </w:t>
+      </w:r>
+      <w:r>
+        <w:rPr/>
+        <w:t xml:space="preserve">threat_assessment</w:t>
+      </w:r>
+      <w:r>
+        <w:rPr/>
+        <w:t xml:space="preserve"> contradiction bug above). Full backend suite: 380 passed, 39 skipped (up from 365 at the start of this review).</w:t>
+      </w:r>
+    </w:p>
+    <w:p>
+      <w:pPr>
+        <w:numPr>
+          <w:ilvl w:val="0"/>
+          <w:numId w:val="8"/>
         </w:numPr>
         <w:spacing w:lineRule="auto"/>
       </w:pPr>
       <w:r>
         <w:rPr/>
         <w:t xml:space="preserve">A 3-hour soak test against the live stack completed cleanly: memory flat throughout (no growth trend), zero spontaneous container restarts.</w:t>
+      </w:r>
+    </w:p>
+    <w:p>
+      <w:pPr>
+        <w:numPr>
+          <w:ilvl w:val="0"/>
+          <w:numId w:val="8"/>
+        </w:numPr>
+        <w:spacing w:lineRule="auto"/>
+      </w:pPr>
+      <w:r>
+        <w:rPr>
+          <w:b/>
+        </w:rPr>
+        <w:t xml:space="preserve">A full functional-testing pass against a genuine clean Windows install</w:t>
+      </w:r>
+      <w:r>
+        <w:rPr/>
+        <w:t xml:space="preserve"> (not the dev stack): real elevated installer run, real </w:t>
+      </w:r>
+      <w:r>
+        <w:rPr/>
+        <w:t xml:space="preserve">docker compose up</w:t>
+      </w:r>
+      <w:r>
+        <w:rPr/>
+        <w:t xml:space="preserve">, real admin account creation/login, real IOC investigations across five IOC types, real AI-backend switching (specifically checking that a valid-but-wrong credential never misreports as "no API key provided" — it doesn't), real threat scoring, provider health, executive dashboard, a real </w:t>
+      </w:r>
+      <w:r>
+        <w:rPr/>
+        <w:t xml:space="preserve">nmap</w:t>
+      </w:r>
+      <w:r>
+        <w:rPr/>
+        <w:t xml:space="preserve"> port scan against </w:t>
+      </w:r>
+      <w:r>
+        <w:rPr/>
+        <w:t xml:space="preserve">127.0.0.1</w:t>
+      </w:r>
+      <w:r>
+        <w:rPr/>
+        <w:t xml:space="preserve">, real PDF/CSV export, and persistence across a real backend restart and a simulated AI-backend outage (Ollama pointed at an unreachable port — graceful degradation confirmed, full recovery confirmed once restored). This pass is what found the three bugs above. It is explicitly disclosed as an interim, not final, pass — see </w:t>
+      </w:r>
+      <w:r>
+        <w:rPr/>
+        <w:t xml:space="preserve">FULL_FUNCTIONAL_TEST_REPORT.md</w:t>
+      </w:r>
+      <w:r>
+        <w:rPr/>
+        <w:t xml:space="preserve"> for the complete list of what was and wasn't covered, including that the Setup Wizard's own GUI was driven via its underlying functions directly rather than clicked through, and that a live Windows reboot test, uninstall/reinstall test, and Linux install test were deliberately deferred rather than performed unattended overnight.</w:t>
       </w:r>
     </w:p>
     <w:p>
@@ -957,7 +1240,7 @@
       <w:pPr>
         <w:numPr>
           <w:ilvl w:val="0"/>
-          <w:numId w:val="8"/>
+          <w:numId w:val="9"/>
         </w:numPr>
         <w:spacing w:lineRule="auto"/>
       </w:pPr>
@@ -1012,7 +1295,7 @@
       <w:pPr>
         <w:numPr>
           <w:ilvl w:val="0"/>
-          <w:numId w:val="8"/>
+          <w:numId w:val="9"/>
         </w:numPr>
         <w:spacing w:lineRule="auto"/>
       </w:pPr>
@@ -1063,7 +1346,7 @@
       <w:pPr>
         <w:numPr>
           <w:ilvl w:val="0"/>
-          <w:numId w:val="8"/>
+          <w:numId w:val="9"/>
         </w:numPr>
         <w:spacing w:lineRule="auto"/>
       </w:pPr>
@@ -1098,7 +1381,7 @@
       <w:pPr>
         <w:numPr>
           <w:ilvl w:val="0"/>
-          <w:numId w:val="8"/>
+          <w:numId w:val="9"/>
         </w:numPr>
         <w:spacing w:lineRule="auto"/>
       </w:pPr>
@@ -1141,7 +1424,7 @@
       <w:pPr>
         <w:numPr>
           <w:ilvl w:val="0"/>
-          <w:numId w:val="8"/>
+          <w:numId w:val="9"/>
         </w:numPr>
         <w:spacing w:lineRule="auto"/>
       </w:pPr>
@@ -1181,7 +1464,7 @@
       <w:pPr>
         <w:numPr>
           <w:ilvl w:val="0"/>
-          <w:numId w:val="9"/>
+          <w:numId w:val="10"/>
         </w:numPr>
         <w:spacing w:lineRule="auto"/>
       </w:pPr>
@@ -1216,7 +1499,7 @@
       <w:pPr>
         <w:numPr>
           <w:ilvl w:val="0"/>
-          <w:numId w:val="9"/>
+          <w:numId w:val="10"/>
         </w:numPr>
         <w:spacing w:lineRule="auto"/>
       </w:pPr>
@@ -1235,7 +1518,7 @@
       <w:pPr>
         <w:numPr>
           <w:ilvl w:val="0"/>
-          <w:numId w:val="9"/>
+          <w:numId w:val="10"/>
         </w:numPr>
         <w:spacing w:lineRule="auto"/>
       </w:pPr>
@@ -1264,7 +1547,7 @@
       <w:pPr>
         <w:numPr>
           <w:ilvl w:val="0"/>
-          <w:numId w:val="10"/>
+          <w:numId w:val="11"/>
         </w:numPr>
         <w:spacing w:lineRule="auto"/>
       </w:pPr>
@@ -1287,7 +1570,7 @@
       <w:pPr>
         <w:numPr>
           <w:ilvl w:val="0"/>
-          <w:numId w:val="10"/>
+          <w:numId w:val="11"/>
         </w:numPr>
         <w:spacing w:lineRule="auto"/>
       </w:pPr>
@@ -1316,7 +1599,7 @@
       <w:pPr>
         <w:numPr>
           <w:ilvl w:val="0"/>
-          <w:numId w:val="10"/>
+          <w:numId w:val="11"/>
         </w:numPr>
         <w:spacing w:lineRule="auto"/>
       </w:pPr>
@@ -1353,7 +1636,7 @@
       <w:pPr>
         <w:numPr>
           <w:ilvl w:val="0"/>
-          <w:numId w:val="10"/>
+          <w:numId w:val="11"/>
         </w:numPr>
         <w:spacing w:lineRule="auto"/>
       </w:pPr>
@@ -1390,7 +1673,7 @@
       <w:pPr>
         <w:numPr>
           <w:ilvl w:val="0"/>
-          <w:numId w:val="10"/>
+          <w:numId w:val="11"/>
         </w:numPr>
         <w:spacing w:lineRule="auto"/>
       </w:pPr>
@@ -1411,7 +1694,7 @@
       <w:pPr>
         <w:numPr>
           <w:ilvl w:val="0"/>
-          <w:numId w:val="10"/>
+          <w:numId w:val="11"/>
         </w:numPr>
         <w:spacing w:lineRule="auto"/>
       </w:pPr>
@@ -1440,7 +1723,7 @@
       <w:pPr>
         <w:numPr>
           <w:ilvl w:val="0"/>
-          <w:numId w:val="10"/>
+          <w:numId w:val="11"/>
         </w:numPr>
         <w:spacing w:lineRule="auto"/>
       </w:pPr>
@@ -1453,7 +1736,7 @@
       <w:pPr>
         <w:numPr>
           <w:ilvl w:val="0"/>
-          <w:numId w:val="10"/>
+          <w:numId w:val="11"/>
         </w:numPr>
         <w:spacing w:lineRule="auto"/>
       </w:pPr>
@@ -1484,7 +1767,7 @@
       <w:pPr>
         <w:numPr>
           <w:ilvl w:val="0"/>
-          <w:numId w:val="11"/>
+          <w:numId w:val="12"/>
         </w:numPr>
         <w:spacing w:lineRule="auto"/>
       </w:pPr>
@@ -1547,7 +1830,7 @@
       <w:pPr>
         <w:numPr>
           <w:ilvl w:val="0"/>
-          <w:numId w:val="11"/>
+          <w:numId w:val="12"/>
         </w:numPr>
         <w:spacing w:lineRule="auto"/>
       </w:pPr>
@@ -1584,7 +1867,7 @@
       <w:pPr>
         <w:numPr>
           <w:ilvl w:val="0"/>
-          <w:numId w:val="11"/>
+          <w:numId w:val="12"/>
         </w:numPr>
         <w:spacing w:lineRule="auto"/>
       </w:pPr>
@@ -1597,7 +1880,7 @@
       <w:pPr>
         <w:numPr>
           <w:ilvl w:val="0"/>
-          <w:numId w:val="11"/>
+          <w:numId w:val="12"/>
         </w:numPr>
         <w:spacing w:lineRule="auto"/>
       </w:pPr>
@@ -1610,7 +1893,7 @@
       <w:pPr>
         <w:numPr>
           <w:ilvl w:val="0"/>
-          <w:numId w:val="11"/>
+          <w:numId w:val="12"/>
         </w:numPr>
         <w:spacing w:lineRule="auto"/>
       </w:pPr>
@@ -1681,7 +1964,7 @@
       <w:pPr>
         <w:numPr>
           <w:ilvl w:val="0"/>
-          <w:numId w:val="12"/>
+          <w:numId w:val="13"/>
         </w:numPr>
         <w:spacing w:lineRule="auto"/>
       </w:pPr>
@@ -1704,7 +1987,7 @@
       <w:pPr>
         <w:numPr>
           <w:ilvl w:val="0"/>
-          <w:numId w:val="12"/>
+          <w:numId w:val="13"/>
         </w:numPr>
         <w:spacing w:lineRule="auto"/>
       </w:pPr>
@@ -1735,7 +2018,7 @@
       <w:pPr>
         <w:numPr>
           <w:ilvl w:val="0"/>
-          <w:numId w:val="13"/>
+          <w:numId w:val="14"/>
         </w:numPr>
         <w:spacing w:lineRule="auto"/>
       </w:pPr>
@@ -1758,7 +2041,7 @@
       <w:pPr>
         <w:numPr>
           <w:ilvl w:val="0"/>
-          <w:numId w:val="13"/>
+          <w:numId w:val="14"/>
         </w:numPr>
         <w:spacing w:lineRule="auto"/>
       </w:pPr>
@@ -1781,7 +2064,7 @@
       <w:pPr>
         <w:numPr>
           <w:ilvl w:val="0"/>
-          <w:numId w:val="13"/>
+          <w:numId w:val="14"/>
         </w:numPr>
         <w:spacing w:lineRule="auto"/>
       </w:pPr>
@@ -1794,7 +2077,7 @@
       <w:pPr>
         <w:numPr>
           <w:ilvl w:val="0"/>
-          <w:numId w:val="13"/>
+          <w:numId w:val="14"/>
         </w:numPr>
         <w:spacing w:lineRule="auto"/>
       </w:pPr>
@@ -1825,7 +2108,7 @@
       <w:pPr>
         <w:numPr>
           <w:ilvl w:val="0"/>
-          <w:numId w:val="14"/>
+          <w:numId w:val="15"/>
         </w:numPr>
         <w:spacing w:lineRule="auto"/>
       </w:pPr>
@@ -1870,7 +2153,7 @@
       <w:pPr>
         <w:numPr>
           <w:ilvl w:val="0"/>
-          <w:numId w:val="14"/>
+          <w:numId w:val="15"/>
         </w:numPr>
         <w:spacing w:lineRule="auto"/>
       </w:pPr>
@@ -1883,7 +2166,7 @@
       <w:pPr>
         <w:numPr>
           <w:ilvl w:val="0"/>
-          <w:numId w:val="14"/>
+          <w:numId w:val="15"/>
         </w:numPr>
         <w:spacing w:lineRule="auto"/>
       </w:pPr>
@@ -1922,7 +2205,7 @@
       <w:pPr>
         <w:numPr>
           <w:ilvl w:val="0"/>
-          <w:numId w:val="15"/>
+          <w:numId w:val="16"/>
         </w:numPr>
         <w:spacing w:lineRule="auto"/>
       </w:pPr>
@@ -1951,7 +2234,7 @@
       <w:pPr>
         <w:numPr>
           <w:ilvl w:val="0"/>
-          <w:numId w:val="15"/>
+          <w:numId w:val="16"/>
         </w:numPr>
         <w:spacing w:lineRule="auto"/>
       </w:pPr>
@@ -1964,7 +2247,7 @@
       <w:pPr>
         <w:numPr>
           <w:ilvl w:val="0"/>
-          <w:numId w:val="15"/>
+          <w:numId w:val="16"/>
         </w:numPr>
         <w:spacing w:lineRule="auto"/>
       </w:pPr>
@@ -1977,7 +2260,7 @@
       <w:pPr>
         <w:numPr>
           <w:ilvl w:val="0"/>
-          <w:numId w:val="15"/>
+          <w:numId w:val="16"/>
         </w:numPr>
         <w:spacing w:lineRule="auto"/>
       </w:pPr>
@@ -2000,7 +2283,7 @@
       <w:pPr>
         <w:numPr>
           <w:ilvl w:val="0"/>
-          <w:numId w:val="16"/>
+          <w:numId w:val="17"/>
         </w:numPr>
         <w:spacing w:lineRule="auto"/>
       </w:pPr>
@@ -2047,7 +2330,7 @@
       <w:pPr>
         <w:numPr>
           <w:ilvl w:val="0"/>
-          <w:numId w:val="17"/>
+          <w:numId w:val="18"/>
         </w:numPr>
         <w:spacing w:lineRule="auto"/>
       </w:pPr>
@@ -2068,7 +2351,7 @@
       <w:pPr>
         <w:numPr>
           <w:ilvl w:val="0"/>
-          <w:numId w:val="17"/>
+          <w:numId w:val="18"/>
         </w:numPr>
         <w:spacing w:lineRule="auto"/>
       </w:pPr>
@@ -2089,7 +2372,7 @@
       <w:pPr>
         <w:numPr>
           <w:ilvl w:val="0"/>
-          <w:numId w:val="17"/>
+          <w:numId w:val="18"/>
         </w:numPr>
         <w:spacing w:lineRule="auto"/>
       </w:pPr>
@@ -2102,7 +2385,7 @@
       <w:pPr>
         <w:numPr>
           <w:ilvl w:val="0"/>
-          <w:numId w:val="17"/>
+          <w:numId w:val="18"/>
         </w:numPr>
         <w:spacing w:lineRule="auto"/>
       </w:pPr>
@@ -2123,7 +2406,7 @@
       <w:pPr>
         <w:numPr>
           <w:ilvl w:val="0"/>
-          <w:numId w:val="17"/>
+          <w:numId w:val="18"/>
         </w:numPr>
         <w:spacing w:lineRule="auto"/>
       </w:pPr>
@@ -2154,7 +2437,7 @@
       <w:pPr>
         <w:numPr>
           <w:ilvl w:val="0"/>
-          <w:numId w:val="18"/>
+          <w:numId w:val="19"/>
         </w:numPr>
         <w:spacing w:lineRule="auto"/>
       </w:pPr>
@@ -2177,7 +2460,7 @@
       <w:pPr>
         <w:numPr>
           <w:ilvl w:val="0"/>
-          <w:numId w:val="19"/>
+          <w:numId w:val="20"/>
         </w:numPr>
         <w:spacing w:lineRule="auto"/>
       </w:pPr>
@@ -2190,7 +2473,7 @@
       <w:pPr>
         <w:numPr>
           <w:ilvl w:val="0"/>
-          <w:numId w:val="19"/>
+          <w:numId w:val="20"/>
         </w:numPr>
         <w:spacing w:lineRule="auto"/>
       </w:pPr>
@@ -2213,7 +2496,7 @@
       <w:pPr>
         <w:numPr>
           <w:ilvl w:val="0"/>
-          <w:numId w:val="20"/>
+          <w:numId w:val="21"/>
         </w:numPr>
         <w:spacing w:lineRule="auto"/>
       </w:pPr>
@@ -2236,7 +2519,7 @@
       <w:pPr>
         <w:numPr>
           <w:ilvl w:val="0"/>
-          <w:numId w:val="21"/>
+          <w:numId w:val="22"/>
         </w:numPr>
         <w:spacing w:lineRule="auto"/>
       </w:pPr>
@@ -2264,7 +2547,7 @@
       <w:pPr>
         <w:numPr>
           <w:ilvl w:val="0"/>
-          <w:numId w:val="22"/>
+          <w:numId w:val="23"/>
         </w:numPr>
         <w:spacing w:lineRule="auto"/>
       </w:pPr>
@@ -2285,7 +2568,7 @@
       <w:pPr>
         <w:numPr>
           <w:ilvl w:val="0"/>
-          <w:numId w:val="22"/>
+          <w:numId w:val="23"/>
         </w:numPr>
         <w:spacing w:lineRule="auto"/>
       </w:pPr>
@@ -2314,7 +2597,7 @@
       <w:pPr>
         <w:numPr>
           <w:ilvl w:val="0"/>
-          <w:numId w:val="22"/>
+          <w:numId w:val="23"/>
         </w:numPr>
         <w:spacing w:lineRule="auto"/>
       </w:pPr>
@@ -2423,7 +2706,7 @@
       <w:pPr>
         <w:numPr>
           <w:ilvl w:val="0"/>
-          <w:numId w:val="22"/>
+          <w:numId w:val="23"/>
         </w:numPr>
         <w:spacing w:lineRule="auto"/>
       </w:pPr>
@@ -2460,7 +2743,7 @@
       <w:pPr>
         <w:numPr>
           <w:ilvl w:val="0"/>
-          <w:numId w:val="22"/>
+          <w:numId w:val="23"/>
         </w:numPr>
         <w:spacing w:lineRule="auto"/>
       </w:pPr>
@@ -2505,7 +2788,7 @@
       <w:pPr>
         <w:numPr>
           <w:ilvl w:val="0"/>
-          <w:numId w:val="22"/>
+          <w:numId w:val="23"/>
         </w:numPr>
         <w:spacing w:lineRule="auto"/>
       </w:pPr>
@@ -2534,7 +2817,7 @@
       <w:pPr>
         <w:numPr>
           <w:ilvl w:val="0"/>
-          <w:numId w:val="22"/>
+          <w:numId w:val="23"/>
         </w:numPr>
         <w:spacing w:lineRule="auto"/>
       </w:pPr>
@@ -2563,7 +2846,7 @@
       <w:pPr>
         <w:numPr>
           <w:ilvl w:val="0"/>
-          <w:numId w:val="22"/>
+          <w:numId w:val="23"/>
         </w:numPr>
         <w:spacing w:lineRule="auto"/>
       </w:pPr>
@@ -2608,7 +2891,7 @@
       <w:pPr>
         <w:numPr>
           <w:ilvl w:val="0"/>
-          <w:numId w:val="22"/>
+          <w:numId w:val="23"/>
         </w:numPr>
         <w:spacing w:lineRule="auto"/>
       </w:pPr>
@@ -5218,6 +5501,128 @@
     </w:lvl>
   </w:abstractNum>
   <w:abstractNum w:abstractNumId="22">
+    <w:lvl w:ilvl="0">
+      <w:start w:val="1"/>
+      <w:numFmt w:val="bullet"/>
+      <w:lvlText w:val=""/>
+      <w:lvlJc w:val="left"/>
+      <w:pPr>
+        <w:tabs>
+          <w:tab w:val="num" w:pos="720"/>
+        </w:tabs>
+        <w:ind w:left="720" w:hanging="360"/>
+      </w:pPr>
+      <w:rPr>
+        <w:rFonts w:ascii="Symbol" w:hAnsi="Symbol" w:hint="default"/>
+      </w:rPr>
+    </w:lvl>
+    <w:lvl w:ilvl="1">
+      <w:start w:val="1"/>
+      <w:numFmt w:val="bullet"/>
+      <w:lvlText w:val=""/>
+      <w:lvlJc w:val="left"/>
+      <w:pPr>
+        <w:tabs>
+          <w:tab w:val="num" w:pos="1440"/>
+        </w:tabs>
+        <w:ind w:left="1440" w:hanging="360"/>
+      </w:pPr>
+      <w:rPr>
+        <w:rFonts w:ascii="Symbol" w:hAnsi="Symbol" w:hint="default"/>
+      </w:rPr>
+    </w:lvl>
+    <w:lvl w:ilvl="2">
+      <w:start w:val="1"/>
+      <w:numFmt w:val="bullet"/>
+      <w:lvlText w:val=""/>
+      <w:lvlJc w:val="left"/>
+      <w:pPr>
+        <w:tabs>
+          <w:tab w:val="num" w:pos="2160"/>
+        </w:tabs>
+        <w:ind w:left="2160" w:hanging="360"/>
+      </w:pPr>
+      <w:rPr>
+        <w:rFonts w:ascii="Symbol" w:hAnsi="Symbol" w:hint="default"/>
+      </w:rPr>
+    </w:lvl>
+    <w:lvl w:ilvl="3">
+      <w:start w:val="1"/>
+      <w:numFmt w:val="bullet"/>
+      <w:lvlText w:val=""/>
+      <w:lvlJc w:val="left"/>
+      <w:pPr>
+        <w:tabs>
+          <w:tab w:val="num" w:pos="2880"/>
+        </w:tabs>
+        <w:ind w:left="2880" w:hanging="360"/>
+      </w:pPr>
+      <w:rPr>
+        <w:rFonts w:ascii="Symbol" w:hAnsi="Symbol" w:hint="default"/>
+      </w:rPr>
+    </w:lvl>
+    <w:lvl w:ilvl="4">
+      <w:start w:val="1"/>
+      <w:numFmt w:val="bullet"/>
+      <w:lvlText w:val=""/>
+      <w:lvlJc w:val="left"/>
+      <w:pPr>
+        <w:tabs>
+          <w:tab w:val="num" w:pos="3600"/>
+        </w:tabs>
+        <w:ind w:left="3600" w:hanging="360"/>
+      </w:pPr>
+      <w:rPr>
+        <w:rFonts w:ascii="Symbol" w:hAnsi="Symbol" w:hint="default"/>
+      </w:rPr>
+    </w:lvl>
+    <w:lvl w:ilvl="5">
+      <w:start w:val="1"/>
+      <w:numFmt w:val="bullet"/>
+      <w:lvlText w:val=""/>
+      <w:lvlJc w:val="left"/>
+      <w:pPr>
+        <w:tabs>
+          <w:tab w:val="num" w:pos="4320"/>
+        </w:tabs>
+        <w:ind w:left="4320" w:hanging="360"/>
+      </w:pPr>
+      <w:rPr>
+        <w:rFonts w:ascii="Symbol" w:hAnsi="Symbol" w:hint="default"/>
+      </w:rPr>
+    </w:lvl>
+    <w:lvl w:ilvl="6">
+      <w:start w:val="1"/>
+      <w:numFmt w:val="bullet"/>
+      <w:lvlText w:val=""/>
+      <w:lvlJc w:val="left"/>
+      <w:pPr>
+        <w:tabs>
+          <w:tab w:val="num" w:pos="5040"/>
+        </w:tabs>
+        <w:ind w:left="5040" w:hanging="360"/>
+      </w:pPr>
+      <w:rPr>
+        <w:rFonts w:ascii="Symbol" w:hAnsi="Symbol" w:hint="default"/>
+      </w:rPr>
+    </w:lvl>
+    <w:lvl w:ilvl="7">
+      <w:start w:val="1"/>
+      <w:numFmt w:val="bullet"/>
+      <w:lvlText w:val=""/>
+      <w:lvlJc w:val="left"/>
+      <w:pPr>
+        <w:tabs>
+          <w:tab w:val="num" w:pos="5760"/>
+        </w:tabs>
+        <w:ind w:left="5760" w:hanging="360"/>
+      </w:pPr>
+      <w:rPr>
+        <w:rFonts w:ascii="Symbol" w:hAnsi="Symbol" w:hint="default"/>
+      </w:rPr>
+    </w:lvl>
+  </w:abstractNum>
+  <w:abstractNum w:abstractNumId="23">
     <w:lvl w:ilvl="0">
       <w:start w:val="1"/>
       <w:numFmt w:val="bullet"/>
@@ -5404,6 +5809,9 @@
   </w:num>
   <w:num w:numId="22">
     <w:abstractNumId w:val="22"/>
+  </w:num>
+  <w:num w:numId="23">
+    <w:abstractNumId w:val="23"/>
   </w:num>
 </w:numbering>
 </file>

</xml_diff>